<commit_message>
Cap nhat quy chuan KHBD moi (bang 2 cot, bo trung lap, danh tu kien thuc, ten truong chuan) va dong bo he thong
</commit_message>
<xml_diff>
--- a/Hệ thống mẫu văn bản/Nguyên đã làm/Lịch báo giảng/Lịch báo giảng - Tuần 04 (THCS).docx
+++ b/Hệ thống mẫu văn bản/Nguyên đã làm/Lịch báo giảng/Lịch báo giảng - Tuần 04 (THCS).docx
@@ -808,12 +808,6 @@
                 <w:szCs w:val="26"/>
               </w:rPr>
             </w:pPr>
-            <w:r>
-              <w:rPr>
-                <w:rFonts w:ascii="Times New Roman" w:hAnsi="Times New Roman"/>
-                <w:sz w:val="26"/>
-              </w:rPr>
-            </w:r>
           </w:p>
         </w:tc>
         <w:tc>
@@ -835,12 +829,6 @@
                 <w:szCs w:val="26"/>
               </w:rPr>
             </w:pPr>
-            <w:r>
-              <w:rPr>
-                <w:rFonts w:ascii="Times New Roman" w:hAnsi="Times New Roman"/>
-                <w:sz w:val="26"/>
-              </w:rPr>
-            </w:r>
           </w:p>
         </w:tc>
         <w:tc>
@@ -862,12 +850,6 @@
                 <w:szCs w:val="26"/>
               </w:rPr>
             </w:pPr>
-            <w:r>
-              <w:rPr>
-                <w:rFonts w:ascii="Times New Roman" w:hAnsi="Times New Roman"/>
-                <w:sz w:val="26"/>
-              </w:rPr>
-            </w:r>
           </w:p>
         </w:tc>
         <w:tc>
@@ -889,12 +871,6 @@
                 <w:szCs w:val="26"/>
               </w:rPr>
             </w:pPr>
-            <w:r>
-              <w:rPr>
-                <w:rFonts w:ascii="Times New Roman" w:hAnsi="Times New Roman"/>
-                <w:sz w:val="26"/>
-              </w:rPr>
-            </w:r>
           </w:p>
         </w:tc>
         <w:tc>
@@ -916,12 +892,6 @@
                 <w:szCs w:val="26"/>
               </w:rPr>
             </w:pPr>
-            <w:r>
-              <w:rPr>
-                <w:rFonts w:ascii="Times New Roman" w:hAnsi="Times New Roman"/>
-                <w:sz w:val="26"/>
-              </w:rPr>
-            </w:r>
           </w:p>
         </w:tc>
       </w:tr>
@@ -999,12 +969,6 @@
                 <w:szCs w:val="26"/>
               </w:rPr>
             </w:pPr>
-            <w:r>
-              <w:rPr>
-                <w:rFonts w:ascii="Times New Roman" w:hAnsi="Times New Roman"/>
-                <w:sz w:val="26"/>
-              </w:rPr>
-            </w:r>
           </w:p>
         </w:tc>
         <w:tc>
@@ -1026,12 +990,6 @@
                 <w:szCs w:val="26"/>
               </w:rPr>
             </w:pPr>
-            <w:r>
-              <w:rPr>
-                <w:rFonts w:ascii="Times New Roman" w:hAnsi="Times New Roman"/>
-                <w:sz w:val="26"/>
-              </w:rPr>
-            </w:r>
           </w:p>
         </w:tc>
         <w:tc>
@@ -1053,12 +1011,6 @@
                 <w:szCs w:val="26"/>
               </w:rPr>
             </w:pPr>
-            <w:r>
-              <w:rPr>
-                <w:rFonts w:ascii="Times New Roman" w:hAnsi="Times New Roman"/>
-                <w:sz w:val="26"/>
-              </w:rPr>
-            </w:r>
           </w:p>
         </w:tc>
         <w:tc>
@@ -1080,12 +1032,6 @@
                 <w:szCs w:val="26"/>
               </w:rPr>
             </w:pPr>
-            <w:r>
-              <w:rPr>
-                <w:rFonts w:ascii="Times New Roman" w:hAnsi="Times New Roman"/>
-                <w:sz w:val="26"/>
-              </w:rPr>
-            </w:r>
           </w:p>
         </w:tc>
         <w:tc>
@@ -1107,12 +1053,6 @@
                 <w:szCs w:val="26"/>
               </w:rPr>
             </w:pPr>
-            <w:r>
-              <w:rPr>
-                <w:rFonts w:ascii="Times New Roman" w:hAnsi="Times New Roman"/>
-                <w:sz w:val="26"/>
-              </w:rPr>
-            </w:r>
           </w:p>
         </w:tc>
       </w:tr>
@@ -1190,12 +1130,6 @@
                 <w:szCs w:val="26"/>
               </w:rPr>
             </w:pPr>
-            <w:r>
-              <w:rPr>
-                <w:rFonts w:ascii="Times New Roman" w:hAnsi="Times New Roman"/>
-                <w:sz w:val="26"/>
-              </w:rPr>
-            </w:r>
           </w:p>
         </w:tc>
         <w:tc>
@@ -1217,12 +1151,6 @@
                 <w:szCs w:val="26"/>
               </w:rPr>
             </w:pPr>
-            <w:r>
-              <w:rPr>
-                <w:rFonts w:ascii="Times New Roman" w:hAnsi="Times New Roman"/>
-                <w:sz w:val="26"/>
-              </w:rPr>
-            </w:r>
           </w:p>
         </w:tc>
         <w:tc>
@@ -1244,12 +1172,6 @@
                 <w:szCs w:val="26"/>
               </w:rPr>
             </w:pPr>
-            <w:r>
-              <w:rPr>
-                <w:rFonts w:ascii="Times New Roman" w:hAnsi="Times New Roman"/>
-                <w:sz w:val="26"/>
-              </w:rPr>
-            </w:r>
           </w:p>
         </w:tc>
         <w:tc>
@@ -1271,12 +1193,6 @@
                 <w:szCs w:val="26"/>
               </w:rPr>
             </w:pPr>
-            <w:r>
-              <w:rPr>
-                <w:rFonts w:ascii="Times New Roman" w:hAnsi="Times New Roman"/>
-                <w:sz w:val="26"/>
-              </w:rPr>
-            </w:r>
           </w:p>
         </w:tc>
         <w:tc>
@@ -1298,12 +1214,6 @@
                 <w:szCs w:val="26"/>
               </w:rPr>
             </w:pPr>
-            <w:r>
-              <w:rPr>
-                <w:rFonts w:ascii="Times New Roman" w:hAnsi="Times New Roman"/>
-                <w:sz w:val="26"/>
-              </w:rPr>
-            </w:r>
           </w:p>
         </w:tc>
       </w:tr>
@@ -1381,13 +1291,6 @@
                 <w:szCs w:val="26"/>
               </w:rPr>
             </w:pPr>
-            <w:r>
-              <w:rPr>
-                <w:rFonts w:ascii="Times New Roman" w:hAnsi="Times New Roman" w:cs="Times New Roman"/>
-                <w:sz w:val="26"/>
-                <w:szCs w:val="26"/>
-              </w:rPr>
-            </w:r>
           </w:p>
         </w:tc>
         <w:tc>
@@ -1409,13 +1312,6 @@
                 <w:szCs w:val="26"/>
               </w:rPr>
             </w:pPr>
-            <w:r>
-              <w:rPr>
-                <w:rFonts w:ascii="Times New Roman" w:hAnsi="Times New Roman" w:cs="Times New Roman"/>
-                <w:sz w:val="26"/>
-                <w:szCs w:val="26"/>
-              </w:rPr>
-            </w:r>
           </w:p>
         </w:tc>
         <w:tc>
@@ -1437,13 +1333,6 @@
                 <w:szCs w:val="26"/>
               </w:rPr>
             </w:pPr>
-            <w:r>
-              <w:rPr>
-                <w:rFonts w:ascii="Times New Roman" w:hAnsi="Times New Roman" w:cs="Times New Roman"/>
-                <w:sz w:val="26"/>
-                <w:szCs w:val="26"/>
-              </w:rPr>
-            </w:r>
           </w:p>
         </w:tc>
         <w:tc>
@@ -1465,13 +1354,6 @@
                 <w:szCs w:val="26"/>
               </w:rPr>
             </w:pPr>
-            <w:r>
-              <w:rPr>
-                <w:rFonts w:ascii="Times New Roman" w:hAnsi="Times New Roman" w:cs="Times New Roman"/>
-                <w:sz w:val="26"/>
-                <w:szCs w:val="26"/>
-              </w:rPr>
-            </w:r>
           </w:p>
         </w:tc>
         <w:tc>
@@ -1493,13 +1375,6 @@
                 <w:szCs w:val="26"/>
               </w:rPr>
             </w:pPr>
-            <w:r>
-              <w:rPr>
-                <w:rFonts w:ascii="Times New Roman" w:hAnsi="Times New Roman" w:cs="Times New Roman"/>
-                <w:sz w:val="26"/>
-                <w:szCs w:val="26"/>
-              </w:rPr>
-            </w:r>
           </w:p>
         </w:tc>
       </w:tr>
@@ -1577,12 +1452,6 @@
                 <w:szCs w:val="26"/>
               </w:rPr>
             </w:pPr>
-            <w:r>
-              <w:rPr>
-                <w:rFonts w:ascii="Times New Roman" w:hAnsi="Times New Roman"/>
-                <w:sz w:val="26"/>
-              </w:rPr>
-            </w:r>
           </w:p>
         </w:tc>
         <w:tc>
@@ -1604,12 +1473,6 @@
                 <w:szCs w:val="26"/>
               </w:rPr>
             </w:pPr>
-            <w:r>
-              <w:rPr>
-                <w:rFonts w:ascii="Times New Roman" w:hAnsi="Times New Roman"/>
-                <w:sz w:val="26"/>
-              </w:rPr>
-            </w:r>
           </w:p>
         </w:tc>
         <w:tc>
@@ -1631,12 +1494,6 @@
                 <w:szCs w:val="26"/>
               </w:rPr>
             </w:pPr>
-            <w:r>
-              <w:rPr>
-                <w:rFonts w:ascii="Times New Roman" w:hAnsi="Times New Roman"/>
-                <w:sz w:val="26"/>
-              </w:rPr>
-            </w:r>
           </w:p>
         </w:tc>
         <w:tc>
@@ -1658,12 +1515,6 @@
                 <w:szCs w:val="26"/>
               </w:rPr>
             </w:pPr>
-            <w:r>
-              <w:rPr>
-                <w:rFonts w:ascii="Times New Roman" w:hAnsi="Times New Roman"/>
-                <w:sz w:val="26"/>
-              </w:rPr>
-            </w:r>
           </w:p>
         </w:tc>
         <w:tc>
@@ -1685,12 +1536,6 @@
                 <w:szCs w:val="26"/>
               </w:rPr>
             </w:pPr>
-            <w:r>
-              <w:rPr>
-                <w:rFonts w:ascii="Times New Roman" w:hAnsi="Times New Roman"/>
-                <w:sz w:val="26"/>
-              </w:rPr>
-            </w:r>
           </w:p>
         </w:tc>
       </w:tr>
@@ -1774,12 +1619,6 @@
                 <w:szCs w:val="26"/>
               </w:rPr>
             </w:pPr>
-            <w:r>
-              <w:rPr>
-                <w:rFonts w:ascii="Times New Roman" w:hAnsi="Times New Roman"/>
-                <w:sz w:val="26"/>
-              </w:rPr>
-            </w:r>
           </w:p>
         </w:tc>
         <w:tc>
@@ -1801,12 +1640,6 @@
                 <w:szCs w:val="26"/>
               </w:rPr>
             </w:pPr>
-            <w:r>
-              <w:rPr>
-                <w:rFonts w:ascii="Times New Roman" w:hAnsi="Times New Roman"/>
-                <w:sz w:val="26"/>
-              </w:rPr>
-            </w:r>
           </w:p>
         </w:tc>
         <w:tc>
@@ -1828,12 +1661,6 @@
                 <w:szCs w:val="26"/>
               </w:rPr>
             </w:pPr>
-            <w:r>
-              <w:rPr>
-                <w:rFonts w:ascii="Times New Roman" w:hAnsi="Times New Roman"/>
-                <w:sz w:val="26"/>
-              </w:rPr>
-            </w:r>
           </w:p>
         </w:tc>
         <w:tc>
@@ -1855,12 +1682,6 @@
                 <w:szCs w:val="26"/>
               </w:rPr>
             </w:pPr>
-            <w:r>
-              <w:rPr>
-                <w:rFonts w:ascii="Times New Roman" w:hAnsi="Times New Roman"/>
-                <w:sz w:val="26"/>
-              </w:rPr>
-            </w:r>
           </w:p>
         </w:tc>
         <w:tc>
@@ -1882,12 +1703,6 @@
                 <w:szCs w:val="26"/>
               </w:rPr>
             </w:pPr>
-            <w:r>
-              <w:rPr>
-                <w:rFonts w:ascii="Times New Roman" w:hAnsi="Times New Roman"/>
-                <w:sz w:val="26"/>
-              </w:rPr>
-            </w:r>
           </w:p>
         </w:tc>
       </w:tr>
@@ -1967,12 +1782,6 @@
                 <w:szCs w:val="26"/>
               </w:rPr>
             </w:pPr>
-            <w:r>
-              <w:rPr>
-                <w:rFonts w:ascii="Times New Roman" w:hAnsi="Times New Roman"/>
-                <w:sz w:val="26"/>
-              </w:rPr>
-            </w:r>
           </w:p>
         </w:tc>
         <w:tc>
@@ -1994,12 +1803,6 @@
                 <w:szCs w:val="26"/>
               </w:rPr>
             </w:pPr>
-            <w:r>
-              <w:rPr>
-                <w:rFonts w:ascii="Times New Roman" w:hAnsi="Times New Roman"/>
-                <w:sz w:val="26"/>
-              </w:rPr>
-            </w:r>
           </w:p>
         </w:tc>
         <w:tc>
@@ -2021,12 +1824,6 @@
                 <w:szCs w:val="26"/>
               </w:rPr>
             </w:pPr>
-            <w:r>
-              <w:rPr>
-                <w:rFonts w:ascii="Times New Roman" w:hAnsi="Times New Roman"/>
-                <w:sz w:val="26"/>
-              </w:rPr>
-            </w:r>
           </w:p>
         </w:tc>
         <w:tc>
@@ -2048,12 +1845,6 @@
                 <w:szCs w:val="26"/>
               </w:rPr>
             </w:pPr>
-            <w:r>
-              <w:rPr>
-                <w:rFonts w:ascii="Times New Roman" w:hAnsi="Times New Roman"/>
-                <w:sz w:val="26"/>
-              </w:rPr>
-            </w:r>
           </w:p>
         </w:tc>
         <w:tc>
@@ -2075,12 +1866,6 @@
                 <w:szCs w:val="26"/>
               </w:rPr>
             </w:pPr>
-            <w:r>
-              <w:rPr>
-                <w:rFonts w:ascii="Times New Roman" w:hAnsi="Times New Roman"/>
-                <w:sz w:val="26"/>
-              </w:rPr>
-            </w:r>
           </w:p>
         </w:tc>
       </w:tr>
@@ -2160,13 +1945,6 @@
                 <w:szCs w:val="26"/>
               </w:rPr>
             </w:pPr>
-            <w:r>
-              <w:rPr>
-                <w:rFonts w:ascii="Times New Roman" w:hAnsi="Times New Roman" w:cs="Times New Roman"/>
-                <w:sz w:val="26"/>
-                <w:szCs w:val="26"/>
-              </w:rPr>
-            </w:r>
           </w:p>
         </w:tc>
         <w:tc>
@@ -2188,13 +1966,6 @@
                 <w:szCs w:val="26"/>
               </w:rPr>
             </w:pPr>
-            <w:r>
-              <w:rPr>
-                <w:rFonts w:ascii="Times New Roman" w:hAnsi="Times New Roman" w:cs="Times New Roman"/>
-                <w:sz w:val="26"/>
-                <w:szCs w:val="26"/>
-              </w:rPr>
-            </w:r>
           </w:p>
         </w:tc>
         <w:tc>
@@ -2216,13 +1987,6 @@
                 <w:szCs w:val="26"/>
               </w:rPr>
             </w:pPr>
-            <w:r>
-              <w:rPr>
-                <w:rFonts w:ascii="Times New Roman" w:hAnsi="Times New Roman" w:cs="Times New Roman"/>
-                <w:sz w:val="26"/>
-                <w:szCs w:val="26"/>
-              </w:rPr>
-            </w:r>
           </w:p>
         </w:tc>
         <w:tc>
@@ -2244,13 +2008,6 @@
                 <w:szCs w:val="26"/>
               </w:rPr>
             </w:pPr>
-            <w:r>
-              <w:rPr>
-                <w:rFonts w:ascii="Times New Roman" w:hAnsi="Times New Roman" w:cs="Times New Roman"/>
-                <w:sz w:val="26"/>
-                <w:szCs w:val="26"/>
-              </w:rPr>
-            </w:r>
           </w:p>
         </w:tc>
         <w:tc>
@@ -2272,13 +2029,6 @@
                 <w:szCs w:val="26"/>
               </w:rPr>
             </w:pPr>
-            <w:r>
-              <w:rPr>
-                <w:rFonts w:ascii="Times New Roman" w:hAnsi="Times New Roman" w:cs="Times New Roman"/>
-                <w:sz w:val="26"/>
-                <w:szCs w:val="26"/>
-              </w:rPr>
-            </w:r>
           </w:p>
         </w:tc>
       </w:tr>
@@ -2358,13 +2108,6 @@
                 <w:szCs w:val="26"/>
               </w:rPr>
             </w:pPr>
-            <w:r>
-              <w:rPr>
-                <w:rFonts w:ascii="Times New Roman" w:hAnsi="Times New Roman" w:cs="Times New Roman"/>
-                <w:sz w:val="26"/>
-                <w:szCs w:val="26"/>
-              </w:rPr>
-            </w:r>
           </w:p>
         </w:tc>
         <w:tc>
@@ -2386,13 +2129,6 @@
                 <w:szCs w:val="26"/>
               </w:rPr>
             </w:pPr>
-            <w:r>
-              <w:rPr>
-                <w:rFonts w:ascii="Times New Roman" w:hAnsi="Times New Roman" w:cs="Times New Roman"/>
-                <w:sz w:val="26"/>
-                <w:szCs w:val="26"/>
-              </w:rPr>
-            </w:r>
           </w:p>
         </w:tc>
         <w:tc>
@@ -2414,13 +2150,6 @@
                 <w:szCs w:val="26"/>
               </w:rPr>
             </w:pPr>
-            <w:r>
-              <w:rPr>
-                <w:rFonts w:ascii="Times New Roman" w:hAnsi="Times New Roman" w:cs="Times New Roman"/>
-                <w:sz w:val="26"/>
-                <w:szCs w:val="26"/>
-              </w:rPr>
-            </w:r>
           </w:p>
         </w:tc>
         <w:tc>
@@ -2442,13 +2171,6 @@
                 <w:szCs w:val="26"/>
               </w:rPr>
             </w:pPr>
-            <w:r>
-              <w:rPr>
-                <w:rFonts w:ascii="Times New Roman" w:hAnsi="Times New Roman" w:cs="Times New Roman"/>
-                <w:sz w:val="26"/>
-                <w:szCs w:val="26"/>
-              </w:rPr>
-            </w:r>
           </w:p>
         </w:tc>
         <w:tc>
@@ -2470,13 +2192,6 @@
                 <w:szCs w:val="26"/>
               </w:rPr>
             </w:pPr>
-            <w:r>
-              <w:rPr>
-                <w:rFonts w:ascii="Times New Roman" w:hAnsi="Times New Roman" w:cs="Times New Roman"/>
-                <w:sz w:val="26"/>
-                <w:szCs w:val="26"/>
-              </w:rPr>
-            </w:r>
           </w:p>
         </w:tc>
       </w:tr>
@@ -2556,12 +2271,6 @@
                 <w:szCs w:val="26"/>
               </w:rPr>
             </w:pPr>
-            <w:r>
-              <w:rPr>
-                <w:rFonts w:ascii="Times New Roman" w:hAnsi="Times New Roman"/>
-                <w:sz w:val="26"/>
-              </w:rPr>
-            </w:r>
           </w:p>
         </w:tc>
         <w:tc>
@@ -2583,12 +2292,6 @@
                 <w:szCs w:val="26"/>
               </w:rPr>
             </w:pPr>
-            <w:r>
-              <w:rPr>
-                <w:rFonts w:ascii="Times New Roman" w:hAnsi="Times New Roman"/>
-                <w:sz w:val="26"/>
-              </w:rPr>
-            </w:r>
           </w:p>
         </w:tc>
         <w:tc>
@@ -2610,12 +2313,6 @@
                 <w:szCs w:val="26"/>
               </w:rPr>
             </w:pPr>
-            <w:r>
-              <w:rPr>
-                <w:rFonts w:ascii="Times New Roman" w:hAnsi="Times New Roman"/>
-                <w:sz w:val="26"/>
-              </w:rPr>
-            </w:r>
           </w:p>
         </w:tc>
         <w:tc>
@@ -2637,12 +2334,6 @@
                 <w:szCs w:val="26"/>
               </w:rPr>
             </w:pPr>
-            <w:r>
-              <w:rPr>
-                <w:rFonts w:ascii="Times New Roman" w:hAnsi="Times New Roman"/>
-                <w:sz w:val="26"/>
-              </w:rPr>
-            </w:r>
           </w:p>
         </w:tc>
         <w:tc>
@@ -2664,12 +2355,6 @@
                 <w:szCs w:val="26"/>
               </w:rPr>
             </w:pPr>
-            <w:r>
-              <w:rPr>
-                <w:rFonts w:ascii="Times New Roman" w:hAnsi="Times New Roman"/>
-                <w:sz w:val="26"/>
-              </w:rPr>
-            </w:r>
           </w:p>
         </w:tc>
       </w:tr>
@@ -2753,12 +2438,6 @@
                 <w:szCs w:val="26"/>
               </w:rPr>
             </w:pPr>
-            <w:r>
-              <w:rPr>
-                <w:rFonts w:ascii="Times New Roman" w:hAnsi="Times New Roman"/>
-                <w:sz w:val="26"/>
-              </w:rPr>
-            </w:r>
           </w:p>
         </w:tc>
         <w:tc>
@@ -2780,12 +2459,6 @@
                 <w:szCs w:val="26"/>
               </w:rPr>
             </w:pPr>
-            <w:r>
-              <w:rPr>
-                <w:rFonts w:ascii="Times New Roman" w:hAnsi="Times New Roman"/>
-                <w:sz w:val="26"/>
-              </w:rPr>
-            </w:r>
           </w:p>
         </w:tc>
         <w:tc>
@@ -2807,12 +2480,6 @@
                 <w:szCs w:val="26"/>
               </w:rPr>
             </w:pPr>
-            <w:r>
-              <w:rPr>
-                <w:rFonts w:ascii="Times New Roman" w:hAnsi="Times New Roman"/>
-                <w:sz w:val="26"/>
-              </w:rPr>
-            </w:r>
           </w:p>
         </w:tc>
         <w:tc>
@@ -2834,12 +2501,6 @@
                 <w:szCs w:val="26"/>
               </w:rPr>
             </w:pPr>
-            <w:r>
-              <w:rPr>
-                <w:rFonts w:ascii="Times New Roman" w:hAnsi="Times New Roman"/>
-                <w:sz w:val="26"/>
-              </w:rPr>
-            </w:r>
           </w:p>
         </w:tc>
         <w:tc>
@@ -2861,12 +2522,6 @@
                 <w:szCs w:val="26"/>
               </w:rPr>
             </w:pPr>
-            <w:r>
-              <w:rPr>
-                <w:rFonts w:ascii="Times New Roman" w:hAnsi="Times New Roman"/>
-                <w:sz w:val="26"/>
-              </w:rPr>
-            </w:r>
           </w:p>
         </w:tc>
       </w:tr>
@@ -2946,13 +2601,6 @@
                 <w:szCs w:val="26"/>
               </w:rPr>
             </w:pPr>
-            <w:r>
-              <w:rPr>
-                <w:rFonts w:ascii="Times New Roman" w:hAnsi="Times New Roman" w:cs="Times New Roman"/>
-                <w:sz w:val="26"/>
-                <w:szCs w:val="26"/>
-              </w:rPr>
-            </w:r>
           </w:p>
         </w:tc>
         <w:tc>
@@ -2974,13 +2622,6 @@
                 <w:szCs w:val="26"/>
               </w:rPr>
             </w:pPr>
-            <w:r>
-              <w:rPr>
-                <w:rFonts w:ascii="Times New Roman" w:hAnsi="Times New Roman" w:cs="Times New Roman"/>
-                <w:sz w:val="26"/>
-                <w:szCs w:val="26"/>
-              </w:rPr>
-            </w:r>
           </w:p>
         </w:tc>
         <w:tc>
@@ -3002,13 +2643,6 @@
                 <w:szCs w:val="26"/>
               </w:rPr>
             </w:pPr>
-            <w:r>
-              <w:rPr>
-                <w:rFonts w:ascii="Times New Roman" w:hAnsi="Times New Roman" w:cs="Times New Roman"/>
-                <w:sz w:val="26"/>
-                <w:szCs w:val="26"/>
-              </w:rPr>
-            </w:r>
           </w:p>
         </w:tc>
         <w:tc>
@@ -3030,13 +2664,6 @@
                 <w:szCs w:val="26"/>
               </w:rPr>
             </w:pPr>
-            <w:r>
-              <w:rPr>
-                <w:rFonts w:ascii="Times New Roman" w:hAnsi="Times New Roman" w:cs="Times New Roman"/>
-                <w:sz w:val="26"/>
-                <w:szCs w:val="26"/>
-              </w:rPr>
-            </w:r>
           </w:p>
         </w:tc>
         <w:tc>
@@ -3058,13 +2685,6 @@
                 <w:szCs w:val="26"/>
               </w:rPr>
             </w:pPr>
-            <w:r>
-              <w:rPr>
-                <w:rFonts w:ascii="Times New Roman" w:hAnsi="Times New Roman" w:cs="Times New Roman"/>
-                <w:sz w:val="26"/>
-                <w:szCs w:val="26"/>
-              </w:rPr>
-            </w:r>
           </w:p>
         </w:tc>
       </w:tr>
@@ -3144,12 +2764,6 @@
                 <w:szCs w:val="26"/>
               </w:rPr>
             </w:pPr>
-            <w:r>
-              <w:rPr>
-                <w:rFonts w:ascii="Times New Roman" w:hAnsi="Times New Roman"/>
-                <w:sz w:val="26"/>
-              </w:rPr>
-            </w:r>
           </w:p>
         </w:tc>
         <w:tc>
@@ -3171,12 +2785,6 @@
                 <w:szCs w:val="26"/>
               </w:rPr>
             </w:pPr>
-            <w:r>
-              <w:rPr>
-                <w:rFonts w:ascii="Times New Roman" w:hAnsi="Times New Roman"/>
-                <w:sz w:val="26"/>
-              </w:rPr>
-            </w:r>
           </w:p>
         </w:tc>
         <w:tc>
@@ -3198,12 +2806,6 @@
                 <w:szCs w:val="26"/>
               </w:rPr>
             </w:pPr>
-            <w:r>
-              <w:rPr>
-                <w:rFonts w:ascii="Times New Roman" w:hAnsi="Times New Roman"/>
-                <w:sz w:val="26"/>
-              </w:rPr>
-            </w:r>
           </w:p>
         </w:tc>
         <w:tc>
@@ -3225,12 +2827,6 @@
                 <w:szCs w:val="26"/>
               </w:rPr>
             </w:pPr>
-            <w:r>
-              <w:rPr>
-                <w:rFonts w:ascii="Times New Roman" w:hAnsi="Times New Roman"/>
-                <w:sz w:val="26"/>
-              </w:rPr>
-            </w:r>
           </w:p>
         </w:tc>
         <w:tc>
@@ -3252,12 +2848,6 @@
                 <w:szCs w:val="26"/>
               </w:rPr>
             </w:pPr>
-            <w:r>
-              <w:rPr>
-                <w:rFonts w:ascii="Times New Roman" w:hAnsi="Times New Roman"/>
-                <w:sz w:val="26"/>
-              </w:rPr>
-            </w:r>
           </w:p>
         </w:tc>
       </w:tr>
@@ -3337,13 +2927,6 @@
                 <w:szCs w:val="26"/>
               </w:rPr>
             </w:pPr>
-            <w:r>
-              <w:rPr>
-                <w:rFonts w:ascii="Times New Roman" w:hAnsi="Times New Roman" w:cs="Times New Roman"/>
-                <w:sz w:val="26"/>
-                <w:szCs w:val="26"/>
-              </w:rPr>
-            </w:r>
           </w:p>
         </w:tc>
         <w:tc>
@@ -3365,13 +2948,6 @@
                 <w:szCs w:val="26"/>
               </w:rPr>
             </w:pPr>
-            <w:r>
-              <w:rPr>
-                <w:rFonts w:ascii="Times New Roman" w:hAnsi="Times New Roman" w:cs="Times New Roman"/>
-                <w:sz w:val="26"/>
-                <w:szCs w:val="26"/>
-              </w:rPr>
-            </w:r>
           </w:p>
         </w:tc>
         <w:tc>
@@ -3393,13 +2969,6 @@
                 <w:szCs w:val="26"/>
               </w:rPr>
             </w:pPr>
-            <w:r>
-              <w:rPr>
-                <w:rFonts w:ascii="Times New Roman" w:hAnsi="Times New Roman" w:cs="Times New Roman"/>
-                <w:sz w:val="26"/>
-                <w:szCs w:val="26"/>
-              </w:rPr>
-            </w:r>
           </w:p>
         </w:tc>
         <w:tc>
@@ -3421,13 +2990,6 @@
                 <w:szCs w:val="26"/>
               </w:rPr>
             </w:pPr>
-            <w:r>
-              <w:rPr>
-                <w:rFonts w:ascii="Times New Roman" w:hAnsi="Times New Roman" w:cs="Times New Roman"/>
-                <w:sz w:val="26"/>
-                <w:szCs w:val="26"/>
-              </w:rPr>
-            </w:r>
           </w:p>
         </w:tc>
         <w:tc>
@@ -3449,13 +3011,6 @@
                 <w:szCs w:val="26"/>
               </w:rPr>
             </w:pPr>
-            <w:r>
-              <w:rPr>
-                <w:rFonts w:ascii="Times New Roman" w:hAnsi="Times New Roman" w:cs="Times New Roman"/>
-                <w:sz w:val="26"/>
-                <w:szCs w:val="26"/>
-              </w:rPr>
-            </w:r>
           </w:p>
         </w:tc>
       </w:tr>
@@ -3535,12 +3090,6 @@
                 <w:szCs w:val="26"/>
               </w:rPr>
             </w:pPr>
-            <w:r>
-              <w:rPr>
-                <w:rFonts w:ascii="Times New Roman" w:hAnsi="Times New Roman"/>
-                <w:sz w:val="26"/>
-              </w:rPr>
-            </w:r>
           </w:p>
         </w:tc>
         <w:tc>
@@ -3562,12 +3111,6 @@
                 <w:szCs w:val="26"/>
               </w:rPr>
             </w:pPr>
-            <w:r>
-              <w:rPr>
-                <w:rFonts w:ascii="Times New Roman" w:hAnsi="Times New Roman"/>
-                <w:sz w:val="26"/>
-              </w:rPr>
-            </w:r>
           </w:p>
         </w:tc>
         <w:tc>
@@ -3589,12 +3132,6 @@
                 <w:szCs w:val="26"/>
               </w:rPr>
             </w:pPr>
-            <w:r>
-              <w:rPr>
-                <w:rFonts w:ascii="Times New Roman" w:hAnsi="Times New Roman"/>
-                <w:sz w:val="26"/>
-              </w:rPr>
-            </w:r>
           </w:p>
         </w:tc>
         <w:tc>
@@ -3616,12 +3153,6 @@
                 <w:szCs w:val="26"/>
               </w:rPr>
             </w:pPr>
-            <w:r>
-              <w:rPr>
-                <w:rFonts w:ascii="Times New Roman" w:hAnsi="Times New Roman"/>
-                <w:sz w:val="26"/>
-              </w:rPr>
-            </w:r>
           </w:p>
         </w:tc>
         <w:tc>
@@ -3643,12 +3174,6 @@
                 <w:szCs w:val="26"/>
               </w:rPr>
             </w:pPr>
-            <w:r>
-              <w:rPr>
-                <w:rFonts w:ascii="Times New Roman" w:hAnsi="Times New Roman"/>
-                <w:sz w:val="26"/>
-              </w:rPr>
-            </w:r>
           </w:p>
         </w:tc>
       </w:tr>
@@ -3732,13 +3257,6 @@
                 <w:szCs w:val="26"/>
               </w:rPr>
             </w:pPr>
-            <w:r>
-              <w:rPr>
-                <w:rFonts w:ascii="Times New Roman" w:hAnsi="Times New Roman" w:cs="Times New Roman"/>
-                <w:sz w:val="26"/>
-                <w:szCs w:val="26"/>
-              </w:rPr>
-            </w:r>
           </w:p>
         </w:tc>
         <w:tc>
@@ -3760,13 +3278,6 @@
                 <w:szCs w:val="26"/>
               </w:rPr>
             </w:pPr>
-            <w:r>
-              <w:rPr>
-                <w:rFonts w:ascii="Times New Roman" w:hAnsi="Times New Roman" w:cs="Times New Roman"/>
-                <w:sz w:val="26"/>
-                <w:szCs w:val="26"/>
-              </w:rPr>
-            </w:r>
           </w:p>
         </w:tc>
         <w:tc>
@@ -3788,13 +3299,6 @@
                 <w:szCs w:val="26"/>
               </w:rPr>
             </w:pPr>
-            <w:r>
-              <w:rPr>
-                <w:rFonts w:ascii="Times New Roman" w:hAnsi="Times New Roman" w:cs="Times New Roman"/>
-                <w:sz w:val="26"/>
-                <w:szCs w:val="26"/>
-              </w:rPr>
-            </w:r>
           </w:p>
         </w:tc>
         <w:tc>
@@ -3816,13 +3320,6 @@
                 <w:szCs w:val="26"/>
               </w:rPr>
             </w:pPr>
-            <w:r>
-              <w:rPr>
-                <w:rFonts w:ascii="Times New Roman" w:hAnsi="Times New Roman" w:cs="Times New Roman"/>
-                <w:sz w:val="26"/>
-                <w:szCs w:val="26"/>
-              </w:rPr>
-            </w:r>
           </w:p>
         </w:tc>
         <w:tc>
@@ -3844,13 +3341,6 @@
                 <w:szCs w:val="26"/>
               </w:rPr>
             </w:pPr>
-            <w:r>
-              <w:rPr>
-                <w:rFonts w:ascii="Times New Roman" w:hAnsi="Times New Roman" w:cs="Times New Roman"/>
-                <w:sz w:val="26"/>
-                <w:szCs w:val="26"/>
-              </w:rPr>
-            </w:r>
           </w:p>
         </w:tc>
       </w:tr>
@@ -3930,13 +3420,6 @@
                 <w:szCs w:val="26"/>
               </w:rPr>
             </w:pPr>
-            <w:r>
-              <w:rPr>
-                <w:rFonts w:ascii="Times New Roman" w:hAnsi="Times New Roman" w:cs="Times New Roman"/>
-                <w:sz w:val="26"/>
-                <w:szCs w:val="26"/>
-              </w:rPr>
-            </w:r>
           </w:p>
         </w:tc>
         <w:tc>
@@ -3958,13 +3441,6 @@
                 <w:szCs w:val="26"/>
               </w:rPr>
             </w:pPr>
-            <w:r>
-              <w:rPr>
-                <w:rFonts w:ascii="Times New Roman" w:hAnsi="Times New Roman" w:cs="Times New Roman"/>
-                <w:sz w:val="26"/>
-                <w:szCs w:val="26"/>
-              </w:rPr>
-            </w:r>
           </w:p>
         </w:tc>
         <w:tc>
@@ -3986,13 +3462,6 @@
                 <w:szCs w:val="26"/>
               </w:rPr>
             </w:pPr>
-            <w:r>
-              <w:rPr>
-                <w:rFonts w:ascii="Times New Roman" w:hAnsi="Times New Roman" w:cs="Times New Roman"/>
-                <w:sz w:val="26"/>
-                <w:szCs w:val="26"/>
-              </w:rPr>
-            </w:r>
           </w:p>
         </w:tc>
         <w:tc>
@@ -4014,13 +3483,6 @@
                 <w:szCs w:val="26"/>
               </w:rPr>
             </w:pPr>
-            <w:r>
-              <w:rPr>
-                <w:rFonts w:ascii="Times New Roman" w:hAnsi="Times New Roman" w:cs="Times New Roman"/>
-                <w:sz w:val="26"/>
-                <w:szCs w:val="26"/>
-              </w:rPr>
-            </w:r>
           </w:p>
         </w:tc>
         <w:tc>
@@ -4042,13 +3504,6 @@
                 <w:szCs w:val="26"/>
               </w:rPr>
             </w:pPr>
-            <w:r>
-              <w:rPr>
-                <w:rFonts w:ascii="Times New Roman" w:hAnsi="Times New Roman" w:cs="Times New Roman"/>
-                <w:sz w:val="26"/>
-                <w:szCs w:val="26"/>
-              </w:rPr>
-            </w:r>
           </w:p>
         </w:tc>
       </w:tr>
@@ -4128,12 +3583,6 @@
                 <w:szCs w:val="26"/>
               </w:rPr>
             </w:pPr>
-            <w:r>
-              <w:rPr>
-                <w:rFonts w:ascii="Times New Roman" w:hAnsi="Times New Roman"/>
-                <w:sz w:val="26"/>
-              </w:rPr>
-            </w:r>
           </w:p>
         </w:tc>
         <w:tc>
@@ -4155,12 +3604,6 @@
                 <w:szCs w:val="26"/>
               </w:rPr>
             </w:pPr>
-            <w:r>
-              <w:rPr>
-                <w:rFonts w:ascii="Times New Roman" w:hAnsi="Times New Roman"/>
-                <w:sz w:val="26"/>
-              </w:rPr>
-            </w:r>
           </w:p>
         </w:tc>
         <w:tc>
@@ -4182,12 +3625,6 @@
                 <w:szCs w:val="26"/>
               </w:rPr>
             </w:pPr>
-            <w:r>
-              <w:rPr>
-                <w:rFonts w:ascii="Times New Roman" w:hAnsi="Times New Roman"/>
-                <w:sz w:val="26"/>
-              </w:rPr>
-            </w:r>
           </w:p>
         </w:tc>
         <w:tc>
@@ -4209,12 +3646,6 @@
                 <w:szCs w:val="26"/>
               </w:rPr>
             </w:pPr>
-            <w:r>
-              <w:rPr>
-                <w:rFonts w:ascii="Times New Roman" w:hAnsi="Times New Roman"/>
-                <w:sz w:val="26"/>
-              </w:rPr>
-            </w:r>
           </w:p>
         </w:tc>
         <w:tc>
@@ -4236,12 +3667,6 @@
                 <w:szCs w:val="26"/>
               </w:rPr>
             </w:pPr>
-            <w:r>
-              <w:rPr>
-                <w:rFonts w:ascii="Times New Roman" w:hAnsi="Times New Roman"/>
-                <w:sz w:val="26"/>
-              </w:rPr>
-            </w:r>
           </w:p>
         </w:tc>
       </w:tr>
@@ -4321,13 +3746,6 @@
                 <w:szCs w:val="26"/>
               </w:rPr>
             </w:pPr>
-            <w:r>
-              <w:rPr>
-                <w:rFonts w:ascii="Times New Roman" w:hAnsi="Times New Roman" w:cs="Times New Roman"/>
-                <w:sz w:val="26"/>
-                <w:szCs w:val="26"/>
-              </w:rPr>
-            </w:r>
           </w:p>
         </w:tc>
         <w:tc>
@@ -4349,13 +3767,6 @@
                 <w:szCs w:val="26"/>
               </w:rPr>
             </w:pPr>
-            <w:r>
-              <w:rPr>
-                <w:rFonts w:ascii="Times New Roman" w:hAnsi="Times New Roman" w:cs="Times New Roman"/>
-                <w:sz w:val="26"/>
-                <w:szCs w:val="26"/>
-              </w:rPr>
-            </w:r>
           </w:p>
         </w:tc>
         <w:tc>
@@ -4377,13 +3788,6 @@
                 <w:szCs w:val="26"/>
               </w:rPr>
             </w:pPr>
-            <w:r>
-              <w:rPr>
-                <w:rFonts w:ascii="Times New Roman" w:hAnsi="Times New Roman" w:cs="Times New Roman"/>
-                <w:sz w:val="26"/>
-                <w:szCs w:val="26"/>
-              </w:rPr>
-            </w:r>
           </w:p>
         </w:tc>
         <w:tc>
@@ -4405,13 +3809,6 @@
                 <w:szCs w:val="26"/>
               </w:rPr>
             </w:pPr>
-            <w:r>
-              <w:rPr>
-                <w:rFonts w:ascii="Times New Roman" w:hAnsi="Times New Roman" w:cs="Times New Roman"/>
-                <w:sz w:val="26"/>
-                <w:szCs w:val="26"/>
-              </w:rPr>
-            </w:r>
           </w:p>
         </w:tc>
         <w:tc>
@@ -4433,13 +3830,6 @@
                 <w:szCs w:val="26"/>
               </w:rPr>
             </w:pPr>
-            <w:r>
-              <w:rPr>
-                <w:rFonts w:ascii="Times New Roman" w:hAnsi="Times New Roman" w:cs="Times New Roman"/>
-                <w:sz w:val="26"/>
-                <w:szCs w:val="26"/>
-              </w:rPr>
-            </w:r>
           </w:p>
         </w:tc>
       </w:tr>
@@ -4519,12 +3909,6 @@
                 <w:szCs w:val="26"/>
               </w:rPr>
             </w:pPr>
-            <w:r>
-              <w:rPr>
-                <w:rFonts w:ascii="Times New Roman" w:hAnsi="Times New Roman"/>
-                <w:sz w:val="26"/>
-              </w:rPr>
-            </w:r>
           </w:p>
         </w:tc>
         <w:tc>
@@ -4546,12 +3930,6 @@
                 <w:szCs w:val="26"/>
               </w:rPr>
             </w:pPr>
-            <w:r>
-              <w:rPr>
-                <w:rFonts w:ascii="Times New Roman" w:hAnsi="Times New Roman"/>
-                <w:sz w:val="26"/>
-              </w:rPr>
-            </w:r>
           </w:p>
         </w:tc>
         <w:tc>
@@ -4573,12 +3951,6 @@
                 <w:szCs w:val="26"/>
               </w:rPr>
             </w:pPr>
-            <w:r>
-              <w:rPr>
-                <w:rFonts w:ascii="Times New Roman" w:hAnsi="Times New Roman"/>
-                <w:sz w:val="26"/>
-              </w:rPr>
-            </w:r>
           </w:p>
         </w:tc>
         <w:tc>
@@ -4600,12 +3972,6 @@
                 <w:szCs w:val="26"/>
               </w:rPr>
             </w:pPr>
-            <w:r>
-              <w:rPr>
-                <w:rFonts w:ascii="Times New Roman" w:hAnsi="Times New Roman"/>
-                <w:sz w:val="26"/>
-              </w:rPr>
-            </w:r>
           </w:p>
         </w:tc>
         <w:tc>
@@ -4627,12 +3993,6 @@
                 <w:szCs w:val="26"/>
               </w:rPr>
             </w:pPr>
-            <w:r>
-              <w:rPr>
-                <w:rFonts w:ascii="Times New Roman" w:hAnsi="Times New Roman"/>
-                <w:sz w:val="26"/>
-              </w:rPr>
-            </w:r>
           </w:p>
         </w:tc>
       </w:tr>
@@ -4716,12 +4076,6 @@
                 <w:szCs w:val="26"/>
               </w:rPr>
             </w:pPr>
-            <w:r>
-              <w:rPr>
-                <w:rFonts w:ascii="Times New Roman" w:hAnsi="Times New Roman"/>
-                <w:sz w:val="26"/>
-              </w:rPr>
-            </w:r>
           </w:p>
         </w:tc>
         <w:tc>
@@ -4743,12 +4097,6 @@
                 <w:szCs w:val="26"/>
               </w:rPr>
             </w:pPr>
-            <w:r>
-              <w:rPr>
-                <w:rFonts w:ascii="Times New Roman" w:hAnsi="Times New Roman"/>
-                <w:sz w:val="26"/>
-              </w:rPr>
-            </w:r>
           </w:p>
         </w:tc>
         <w:tc>
@@ -4770,12 +4118,6 @@
                 <w:szCs w:val="26"/>
               </w:rPr>
             </w:pPr>
-            <w:r>
-              <w:rPr>
-                <w:rFonts w:ascii="Times New Roman" w:hAnsi="Times New Roman"/>
-                <w:sz w:val="26"/>
-              </w:rPr>
-            </w:r>
           </w:p>
         </w:tc>
         <w:tc>
@@ -4797,12 +4139,6 @@
                 <w:szCs w:val="26"/>
               </w:rPr>
             </w:pPr>
-            <w:r>
-              <w:rPr>
-                <w:rFonts w:ascii="Times New Roman" w:hAnsi="Times New Roman"/>
-                <w:sz w:val="26"/>
-              </w:rPr>
-            </w:r>
           </w:p>
         </w:tc>
         <w:tc>
@@ -4824,12 +4160,6 @@
                 <w:szCs w:val="26"/>
               </w:rPr>
             </w:pPr>
-            <w:r>
-              <w:rPr>
-                <w:rFonts w:ascii="Times New Roman" w:hAnsi="Times New Roman"/>
-                <w:sz w:val="26"/>
-              </w:rPr>
-            </w:r>
           </w:p>
         </w:tc>
       </w:tr>
@@ -4906,13 +4236,6 @@
                 <w:szCs w:val="26"/>
               </w:rPr>
             </w:pPr>
-            <w:r>
-              <w:rPr>
-                <w:rFonts w:ascii="Times New Roman" w:hAnsi="Times New Roman" w:cs="Times New Roman"/>
-                <w:sz w:val="26"/>
-                <w:szCs w:val="26"/>
-              </w:rPr>
-            </w:r>
           </w:p>
         </w:tc>
         <w:tc>
@@ -4934,13 +4257,6 @@
                 <w:szCs w:val="26"/>
               </w:rPr>
             </w:pPr>
-            <w:r>
-              <w:rPr>
-                <w:rFonts w:ascii="Times New Roman" w:hAnsi="Times New Roman" w:cs="Times New Roman"/>
-                <w:sz w:val="26"/>
-                <w:szCs w:val="26"/>
-              </w:rPr>
-            </w:r>
           </w:p>
         </w:tc>
         <w:tc>
@@ -4962,13 +4278,6 @@
                 <w:szCs w:val="26"/>
               </w:rPr>
             </w:pPr>
-            <w:r>
-              <w:rPr>
-                <w:rFonts w:ascii="Times New Roman" w:hAnsi="Times New Roman" w:cs="Times New Roman"/>
-                <w:sz w:val="26"/>
-                <w:szCs w:val="26"/>
-              </w:rPr>
-            </w:r>
           </w:p>
         </w:tc>
         <w:tc>
@@ -4990,13 +4299,6 @@
                 <w:szCs w:val="26"/>
               </w:rPr>
             </w:pPr>
-            <w:r>
-              <w:rPr>
-                <w:rFonts w:ascii="Times New Roman" w:hAnsi="Times New Roman" w:cs="Times New Roman"/>
-                <w:sz w:val="26"/>
-                <w:szCs w:val="26"/>
-              </w:rPr>
-            </w:r>
           </w:p>
         </w:tc>
         <w:tc>
@@ -5018,13 +4320,6 @@
                 <w:szCs w:val="26"/>
               </w:rPr>
             </w:pPr>
-            <w:r>
-              <w:rPr>
-                <w:rFonts w:ascii="Times New Roman" w:hAnsi="Times New Roman" w:cs="Times New Roman"/>
-                <w:sz w:val="26"/>
-                <w:szCs w:val="26"/>
-              </w:rPr>
-            </w:r>
           </w:p>
         </w:tc>
       </w:tr>
@@ -5101,13 +4396,6 @@
                 <w:szCs w:val="26"/>
               </w:rPr>
             </w:pPr>
-            <w:r>
-              <w:rPr>
-                <w:rFonts w:ascii="Times New Roman" w:hAnsi="Times New Roman" w:cs="Times New Roman"/>
-                <w:sz w:val="26"/>
-                <w:szCs w:val="26"/>
-              </w:rPr>
-            </w:r>
           </w:p>
         </w:tc>
         <w:tc>
@@ -5129,13 +4417,6 @@
                 <w:szCs w:val="26"/>
               </w:rPr>
             </w:pPr>
-            <w:r>
-              <w:rPr>
-                <w:rFonts w:ascii="Times New Roman" w:hAnsi="Times New Roman" w:cs="Times New Roman"/>
-                <w:sz w:val="26"/>
-                <w:szCs w:val="26"/>
-              </w:rPr>
-            </w:r>
           </w:p>
         </w:tc>
         <w:tc>
@@ -5157,13 +4438,6 @@
                 <w:szCs w:val="26"/>
               </w:rPr>
             </w:pPr>
-            <w:r>
-              <w:rPr>
-                <w:rFonts w:ascii="Times New Roman" w:hAnsi="Times New Roman" w:cs="Times New Roman"/>
-                <w:sz w:val="26"/>
-                <w:szCs w:val="26"/>
-              </w:rPr>
-            </w:r>
           </w:p>
         </w:tc>
         <w:tc>
@@ -5185,13 +4459,6 @@
                 <w:szCs w:val="26"/>
               </w:rPr>
             </w:pPr>
-            <w:r>
-              <w:rPr>
-                <w:rFonts w:ascii="Times New Roman" w:hAnsi="Times New Roman" w:cs="Times New Roman"/>
-                <w:sz w:val="26"/>
-                <w:szCs w:val="26"/>
-              </w:rPr>
-            </w:r>
           </w:p>
         </w:tc>
         <w:tc>
@@ -5213,13 +4480,6 @@
                 <w:szCs w:val="26"/>
               </w:rPr>
             </w:pPr>
-            <w:r>
-              <w:rPr>
-                <w:rFonts w:ascii="Times New Roman" w:hAnsi="Times New Roman" w:cs="Times New Roman"/>
-                <w:sz w:val="26"/>
-                <w:szCs w:val="26"/>
-              </w:rPr>
-            </w:r>
           </w:p>
         </w:tc>
       </w:tr>
@@ -5754,6 +5014,43 @@
               </w:rPr>
               <w:br/>
               <w:t>Tổ trưởng</w:t>
+            </w:r>
+          </w:p>
+          <w:p>
+            <w:pPr>
+              <w:jc w:val="center"/>
+              <w:rPr>
+                <w:rFonts w:ascii="Times New Roman" w:hAnsi="Times New Roman" w:cs="Times New Roman"/>
+                <w:sz w:val="26"/>
+                <w:szCs w:val="26"/>
+              </w:rPr>
+            </w:pPr>
+          </w:p>
+          <w:p>
+            <w:pPr>
+              <w:jc w:val="center"/>
+              <w:rPr>
+                <w:rFonts w:ascii="Times New Roman" w:hAnsi="Times New Roman" w:cs="Times New Roman"/>
+                <w:sz w:val="26"/>
+                <w:szCs w:val="26"/>
+              </w:rPr>
+            </w:pPr>
+          </w:p>
+          <w:p>
+            <w:pPr>
+              <w:jc w:val="center"/>
+              <w:rPr>
+                <w:rFonts w:ascii="Times New Roman" w:hAnsi="Times New Roman" w:cs="Times New Roman"/>
+                <w:sz w:val="26"/>
+                <w:szCs w:val="26"/>
+              </w:rPr>
+            </w:pPr>
+            <w:r>
+              <w:rPr>
+                <w:rFonts w:ascii="Times New Roman" w:hAnsi="Times New Roman" w:cs="Times New Roman"/>
+                <w:sz w:val="26"/>
+                <w:szCs w:val="26"/>
+              </w:rPr>
               <w:br/>
               <w:t>Nguyễn Thị Ngọc Ánh</w:t>
             </w:r>
@@ -5769,11 +5066,6 @@
         </w:tc>
       </w:tr>
     </w:tbl>
-    <w:p>
-      <w:r>
-        <w:br w:type="page"/>
-      </w:r>
-    </w:p>
     <w:p>
       <w:pPr>
         <w:spacing w:after="0" w:line="240" w:lineRule="auto"/>
@@ -5785,6 +5077,7 @@
         <w:rPr>
           <w:i/>
         </w:rPr>
+        <w:lastRenderedPageBreak/>
         <w:t>Buổi…chiều…..Tuần…04…(Từ ngày…24/08/2026…đến ngày:… 28/08/2026….)</w:t>
       </w:r>
     </w:p>
@@ -6143,12 +5436,6 @@
                 <w:szCs w:val="26"/>
               </w:rPr>
             </w:pPr>
-            <w:r>
-              <w:rPr>
-                <w:rFonts w:ascii="Times New Roman" w:hAnsi="Times New Roman"/>
-                <w:sz w:val="26"/>
-              </w:rPr>
-            </w:r>
           </w:p>
         </w:tc>
         <w:tc>
@@ -6170,12 +5457,6 @@
                 <w:szCs w:val="26"/>
               </w:rPr>
             </w:pPr>
-            <w:r>
-              <w:rPr>
-                <w:rFonts w:ascii="Times New Roman" w:hAnsi="Times New Roman"/>
-                <w:sz w:val="26"/>
-              </w:rPr>
-            </w:r>
           </w:p>
         </w:tc>
         <w:tc>
@@ -6197,12 +5478,6 @@
                 <w:szCs w:val="26"/>
               </w:rPr>
             </w:pPr>
-            <w:r>
-              <w:rPr>
-                <w:rFonts w:ascii="Times New Roman" w:hAnsi="Times New Roman"/>
-                <w:sz w:val="26"/>
-              </w:rPr>
-            </w:r>
           </w:p>
         </w:tc>
         <w:tc>
@@ -6224,12 +5499,6 @@
                 <w:szCs w:val="26"/>
               </w:rPr>
             </w:pPr>
-            <w:r>
-              <w:rPr>
-                <w:rFonts w:ascii="Times New Roman" w:hAnsi="Times New Roman"/>
-                <w:sz w:val="26"/>
-              </w:rPr>
-            </w:r>
           </w:p>
         </w:tc>
         <w:tc>
@@ -6251,12 +5520,6 @@
                 <w:szCs w:val="26"/>
               </w:rPr>
             </w:pPr>
-            <w:r>
-              <w:rPr>
-                <w:rFonts w:ascii="Times New Roman" w:hAnsi="Times New Roman"/>
-                <w:sz w:val="26"/>
-              </w:rPr>
-            </w:r>
           </w:p>
         </w:tc>
       </w:tr>
@@ -6334,12 +5597,6 @@
                 <w:szCs w:val="26"/>
               </w:rPr>
             </w:pPr>
-            <w:r>
-              <w:rPr>
-                <w:rFonts w:ascii="Times New Roman" w:hAnsi="Times New Roman"/>
-                <w:sz w:val="26"/>
-              </w:rPr>
-            </w:r>
           </w:p>
         </w:tc>
         <w:tc>
@@ -6361,12 +5618,6 @@
                 <w:szCs w:val="26"/>
               </w:rPr>
             </w:pPr>
-            <w:r>
-              <w:rPr>
-                <w:rFonts w:ascii="Times New Roman" w:hAnsi="Times New Roman"/>
-                <w:sz w:val="26"/>
-              </w:rPr>
-            </w:r>
           </w:p>
         </w:tc>
         <w:tc>
@@ -6388,12 +5639,6 @@
                 <w:szCs w:val="26"/>
               </w:rPr>
             </w:pPr>
-            <w:r>
-              <w:rPr>
-                <w:rFonts w:ascii="Times New Roman" w:hAnsi="Times New Roman"/>
-                <w:sz w:val="26"/>
-              </w:rPr>
-            </w:r>
           </w:p>
         </w:tc>
         <w:tc>
@@ -6415,12 +5660,6 @@
                 <w:szCs w:val="26"/>
               </w:rPr>
             </w:pPr>
-            <w:r>
-              <w:rPr>
-                <w:rFonts w:ascii="Times New Roman" w:hAnsi="Times New Roman"/>
-                <w:sz w:val="26"/>
-              </w:rPr>
-            </w:r>
           </w:p>
         </w:tc>
         <w:tc>
@@ -6442,12 +5681,6 @@
                 <w:szCs w:val="26"/>
               </w:rPr>
             </w:pPr>
-            <w:r>
-              <w:rPr>
-                <w:rFonts w:ascii="Times New Roman" w:hAnsi="Times New Roman"/>
-                <w:sz w:val="26"/>
-              </w:rPr>
-            </w:r>
           </w:p>
         </w:tc>
       </w:tr>
@@ -6525,12 +5758,6 @@
                 <w:szCs w:val="26"/>
               </w:rPr>
             </w:pPr>
-            <w:r>
-              <w:rPr>
-                <w:rFonts w:ascii="Times New Roman" w:hAnsi="Times New Roman"/>
-                <w:sz w:val="26"/>
-              </w:rPr>
-            </w:r>
           </w:p>
         </w:tc>
         <w:tc>
@@ -6552,12 +5779,6 @@
                 <w:szCs w:val="26"/>
               </w:rPr>
             </w:pPr>
-            <w:r>
-              <w:rPr>
-                <w:rFonts w:ascii="Times New Roman" w:hAnsi="Times New Roman"/>
-                <w:sz w:val="26"/>
-              </w:rPr>
-            </w:r>
           </w:p>
         </w:tc>
         <w:tc>
@@ -6579,12 +5800,6 @@
                 <w:szCs w:val="26"/>
               </w:rPr>
             </w:pPr>
-            <w:r>
-              <w:rPr>
-                <w:rFonts w:ascii="Times New Roman" w:hAnsi="Times New Roman"/>
-                <w:sz w:val="26"/>
-              </w:rPr>
-            </w:r>
           </w:p>
         </w:tc>
         <w:tc>
@@ -6606,12 +5821,6 @@
                 <w:szCs w:val="26"/>
               </w:rPr>
             </w:pPr>
-            <w:r>
-              <w:rPr>
-                <w:rFonts w:ascii="Times New Roman" w:hAnsi="Times New Roman"/>
-                <w:sz w:val="26"/>
-              </w:rPr>
-            </w:r>
           </w:p>
         </w:tc>
         <w:tc>
@@ -6633,12 +5842,6 @@
                 <w:szCs w:val="26"/>
               </w:rPr>
             </w:pPr>
-            <w:r>
-              <w:rPr>
-                <w:rFonts w:ascii="Times New Roman" w:hAnsi="Times New Roman"/>
-                <w:sz w:val="26"/>
-              </w:rPr>
-            </w:r>
           </w:p>
         </w:tc>
       </w:tr>
@@ -6716,12 +5919,6 @@
                 <w:szCs w:val="26"/>
               </w:rPr>
             </w:pPr>
-            <w:r>
-              <w:rPr>
-                <w:rFonts w:ascii="Times New Roman" w:hAnsi="Times New Roman"/>
-                <w:sz w:val="26"/>
-              </w:rPr>
-            </w:r>
           </w:p>
         </w:tc>
         <w:tc>
@@ -6743,12 +5940,6 @@
                 <w:szCs w:val="26"/>
               </w:rPr>
             </w:pPr>
-            <w:r>
-              <w:rPr>
-                <w:rFonts w:ascii="Times New Roman" w:hAnsi="Times New Roman"/>
-                <w:sz w:val="26"/>
-              </w:rPr>
-            </w:r>
           </w:p>
         </w:tc>
         <w:tc>
@@ -6770,12 +5961,6 @@
                 <w:szCs w:val="26"/>
               </w:rPr>
             </w:pPr>
-            <w:r>
-              <w:rPr>
-                <w:rFonts w:ascii="Times New Roman" w:hAnsi="Times New Roman"/>
-                <w:sz w:val="26"/>
-              </w:rPr>
-            </w:r>
           </w:p>
         </w:tc>
         <w:tc>
@@ -6797,12 +5982,6 @@
                 <w:szCs w:val="26"/>
               </w:rPr>
             </w:pPr>
-            <w:r>
-              <w:rPr>
-                <w:rFonts w:ascii="Times New Roman" w:hAnsi="Times New Roman"/>
-                <w:sz w:val="26"/>
-              </w:rPr>
-            </w:r>
           </w:p>
         </w:tc>
         <w:tc>
@@ -6824,12 +6003,6 @@
                 <w:szCs w:val="26"/>
               </w:rPr>
             </w:pPr>
-            <w:r>
-              <w:rPr>
-                <w:rFonts w:ascii="Times New Roman" w:hAnsi="Times New Roman"/>
-                <w:sz w:val="26"/>
-              </w:rPr>
-            </w:r>
           </w:p>
         </w:tc>
       </w:tr>
@@ -6907,12 +6080,6 @@
                 <w:szCs w:val="26"/>
               </w:rPr>
             </w:pPr>
-            <w:r>
-              <w:rPr>
-                <w:rFonts w:ascii="Times New Roman" w:hAnsi="Times New Roman"/>
-                <w:sz w:val="26"/>
-              </w:rPr>
-            </w:r>
           </w:p>
         </w:tc>
         <w:tc>
@@ -6934,12 +6101,6 @@
                 <w:szCs w:val="26"/>
               </w:rPr>
             </w:pPr>
-            <w:r>
-              <w:rPr>
-                <w:rFonts w:ascii="Times New Roman" w:hAnsi="Times New Roman"/>
-                <w:sz w:val="26"/>
-              </w:rPr>
-            </w:r>
           </w:p>
         </w:tc>
         <w:tc>
@@ -6961,12 +6122,6 @@
                 <w:szCs w:val="26"/>
               </w:rPr>
             </w:pPr>
-            <w:r>
-              <w:rPr>
-                <w:rFonts w:ascii="Times New Roman" w:hAnsi="Times New Roman"/>
-                <w:sz w:val="26"/>
-              </w:rPr>
-            </w:r>
           </w:p>
         </w:tc>
         <w:tc>
@@ -6988,12 +6143,6 @@
                 <w:szCs w:val="26"/>
               </w:rPr>
             </w:pPr>
-            <w:r>
-              <w:rPr>
-                <w:rFonts w:ascii="Times New Roman" w:hAnsi="Times New Roman"/>
-                <w:sz w:val="26"/>
-              </w:rPr>
-            </w:r>
           </w:p>
         </w:tc>
         <w:tc>
@@ -7015,12 +6164,6 @@
                 <w:szCs w:val="26"/>
               </w:rPr>
             </w:pPr>
-            <w:r>
-              <w:rPr>
-                <w:rFonts w:ascii="Times New Roman" w:hAnsi="Times New Roman"/>
-                <w:sz w:val="26"/>
-              </w:rPr>
-            </w:r>
           </w:p>
         </w:tc>
       </w:tr>
@@ -7104,13 +6247,6 @@
                 <w:szCs w:val="26"/>
               </w:rPr>
             </w:pPr>
-            <w:r>
-              <w:rPr>
-                <w:rFonts w:ascii="Times New Roman" w:hAnsi="Times New Roman" w:cs="Times New Roman"/>
-                <w:sz w:val="26"/>
-                <w:szCs w:val="26"/>
-              </w:rPr>
-            </w:r>
           </w:p>
         </w:tc>
         <w:tc>
@@ -7132,13 +6268,6 @@
                 <w:szCs w:val="26"/>
               </w:rPr>
             </w:pPr>
-            <w:r>
-              <w:rPr>
-                <w:rFonts w:ascii="Times New Roman" w:hAnsi="Times New Roman" w:cs="Times New Roman"/>
-                <w:sz w:val="26"/>
-                <w:szCs w:val="26"/>
-              </w:rPr>
-            </w:r>
           </w:p>
         </w:tc>
         <w:tc>
@@ -7160,13 +6289,6 @@
                 <w:szCs w:val="26"/>
               </w:rPr>
             </w:pPr>
-            <w:r>
-              <w:rPr>
-                <w:rFonts w:ascii="Times New Roman" w:hAnsi="Times New Roman" w:cs="Times New Roman"/>
-                <w:sz w:val="26"/>
-                <w:szCs w:val="26"/>
-              </w:rPr>
-            </w:r>
           </w:p>
         </w:tc>
         <w:tc>
@@ -7188,13 +6310,6 @@
                 <w:szCs w:val="26"/>
               </w:rPr>
             </w:pPr>
-            <w:r>
-              <w:rPr>
-                <w:rFonts w:ascii="Times New Roman" w:hAnsi="Times New Roman" w:cs="Times New Roman"/>
-                <w:sz w:val="26"/>
-                <w:szCs w:val="26"/>
-              </w:rPr>
-            </w:r>
           </w:p>
         </w:tc>
         <w:tc>
@@ -7216,13 +6331,6 @@
                 <w:szCs w:val="26"/>
               </w:rPr>
             </w:pPr>
-            <w:r>
-              <w:rPr>
-                <w:rFonts w:ascii="Times New Roman" w:hAnsi="Times New Roman" w:cs="Times New Roman"/>
-                <w:sz w:val="26"/>
-                <w:szCs w:val="26"/>
-              </w:rPr>
-            </w:r>
           </w:p>
         </w:tc>
       </w:tr>
@@ -7302,13 +6410,6 @@
                 <w:szCs w:val="26"/>
               </w:rPr>
             </w:pPr>
-            <w:r>
-              <w:rPr>
-                <w:rFonts w:ascii="Times New Roman" w:hAnsi="Times New Roman" w:cs="Times New Roman"/>
-                <w:sz w:val="26"/>
-                <w:szCs w:val="26"/>
-              </w:rPr>
-            </w:r>
           </w:p>
         </w:tc>
         <w:tc>
@@ -7330,13 +6431,6 @@
                 <w:szCs w:val="26"/>
               </w:rPr>
             </w:pPr>
-            <w:r>
-              <w:rPr>
-                <w:rFonts w:ascii="Times New Roman" w:hAnsi="Times New Roman" w:cs="Times New Roman"/>
-                <w:sz w:val="26"/>
-                <w:szCs w:val="26"/>
-              </w:rPr>
-            </w:r>
           </w:p>
         </w:tc>
         <w:tc>
@@ -7358,13 +6452,6 @@
                 <w:szCs w:val="26"/>
               </w:rPr>
             </w:pPr>
-            <w:r>
-              <w:rPr>
-                <w:rFonts w:ascii="Times New Roman" w:hAnsi="Times New Roman" w:cs="Times New Roman"/>
-                <w:sz w:val="26"/>
-                <w:szCs w:val="26"/>
-              </w:rPr>
-            </w:r>
           </w:p>
         </w:tc>
         <w:tc>
@@ -7386,13 +6473,6 @@
                 <w:szCs w:val="26"/>
               </w:rPr>
             </w:pPr>
-            <w:r>
-              <w:rPr>
-                <w:rFonts w:ascii="Times New Roman" w:hAnsi="Times New Roman" w:cs="Times New Roman"/>
-                <w:sz w:val="26"/>
-                <w:szCs w:val="26"/>
-              </w:rPr>
-            </w:r>
           </w:p>
         </w:tc>
         <w:tc>
@@ -7414,13 +6494,6 @@
                 <w:szCs w:val="26"/>
               </w:rPr>
             </w:pPr>
-            <w:r>
-              <w:rPr>
-                <w:rFonts w:ascii="Times New Roman" w:hAnsi="Times New Roman" w:cs="Times New Roman"/>
-                <w:sz w:val="26"/>
-                <w:szCs w:val="26"/>
-              </w:rPr>
-            </w:r>
           </w:p>
         </w:tc>
       </w:tr>
@@ -7906,12 +6979,6 @@
                 <w:szCs w:val="26"/>
               </w:rPr>
             </w:pPr>
-            <w:r>
-              <w:rPr>
-                <w:rFonts w:ascii="Times New Roman" w:hAnsi="Times New Roman"/>
-                <w:sz w:val="26"/>
-              </w:rPr>
-            </w:r>
           </w:p>
         </w:tc>
         <w:tc>
@@ -7933,12 +7000,6 @@
                 <w:szCs w:val="26"/>
               </w:rPr>
             </w:pPr>
-            <w:r>
-              <w:rPr>
-                <w:rFonts w:ascii="Times New Roman" w:hAnsi="Times New Roman"/>
-                <w:sz w:val="26"/>
-              </w:rPr>
-            </w:r>
           </w:p>
         </w:tc>
         <w:tc>
@@ -7960,12 +7021,6 @@
                 <w:szCs w:val="26"/>
               </w:rPr>
             </w:pPr>
-            <w:r>
-              <w:rPr>
-                <w:rFonts w:ascii="Times New Roman" w:hAnsi="Times New Roman"/>
-                <w:sz w:val="26"/>
-              </w:rPr>
-            </w:r>
           </w:p>
         </w:tc>
         <w:tc>
@@ -7987,12 +7042,6 @@
                 <w:szCs w:val="26"/>
               </w:rPr>
             </w:pPr>
-            <w:r>
-              <w:rPr>
-                <w:rFonts w:ascii="Times New Roman" w:hAnsi="Times New Roman"/>
-                <w:sz w:val="26"/>
-              </w:rPr>
-            </w:r>
           </w:p>
         </w:tc>
         <w:tc>
@@ -8014,12 +7063,6 @@
                 <w:szCs w:val="26"/>
               </w:rPr>
             </w:pPr>
-            <w:r>
-              <w:rPr>
-                <w:rFonts w:ascii="Times New Roman" w:hAnsi="Times New Roman"/>
-                <w:sz w:val="26"/>
-              </w:rPr>
-            </w:r>
           </w:p>
         </w:tc>
       </w:tr>
@@ -8103,12 +7146,6 @@
                 <w:szCs w:val="26"/>
               </w:rPr>
             </w:pPr>
-            <w:r>
-              <w:rPr>
-                <w:rFonts w:ascii="Times New Roman" w:hAnsi="Times New Roman"/>
-                <w:sz w:val="26"/>
-              </w:rPr>
-            </w:r>
           </w:p>
         </w:tc>
         <w:tc>
@@ -8130,12 +7167,6 @@
                 <w:szCs w:val="26"/>
               </w:rPr>
             </w:pPr>
-            <w:r>
-              <w:rPr>
-                <w:rFonts w:ascii="Times New Roman" w:hAnsi="Times New Roman"/>
-                <w:sz w:val="26"/>
-              </w:rPr>
-            </w:r>
           </w:p>
         </w:tc>
         <w:tc>
@@ -8157,12 +7188,6 @@
                 <w:szCs w:val="26"/>
               </w:rPr>
             </w:pPr>
-            <w:r>
-              <w:rPr>
-                <w:rFonts w:ascii="Times New Roman" w:hAnsi="Times New Roman"/>
-                <w:sz w:val="26"/>
-              </w:rPr>
-            </w:r>
           </w:p>
         </w:tc>
         <w:tc>
@@ -8184,12 +7209,6 @@
                 <w:szCs w:val="26"/>
               </w:rPr>
             </w:pPr>
-            <w:r>
-              <w:rPr>
-                <w:rFonts w:ascii="Times New Roman" w:hAnsi="Times New Roman"/>
-                <w:sz w:val="26"/>
-              </w:rPr>
-            </w:r>
           </w:p>
         </w:tc>
         <w:tc>
@@ -8211,12 +7230,6 @@
                 <w:szCs w:val="26"/>
               </w:rPr>
             </w:pPr>
-            <w:r>
-              <w:rPr>
-                <w:rFonts w:ascii="Times New Roman" w:hAnsi="Times New Roman"/>
-                <w:sz w:val="26"/>
-              </w:rPr>
-            </w:r>
           </w:p>
         </w:tc>
       </w:tr>
@@ -8296,12 +7309,6 @@
                 <w:szCs w:val="26"/>
               </w:rPr>
             </w:pPr>
-            <w:r>
-              <w:rPr>
-                <w:rFonts w:ascii="Times New Roman" w:hAnsi="Times New Roman"/>
-                <w:sz w:val="26"/>
-              </w:rPr>
-            </w:r>
           </w:p>
         </w:tc>
         <w:tc>
@@ -8323,12 +7330,6 @@
                 <w:szCs w:val="26"/>
               </w:rPr>
             </w:pPr>
-            <w:r>
-              <w:rPr>
-                <w:rFonts w:ascii="Times New Roman" w:hAnsi="Times New Roman"/>
-                <w:sz w:val="26"/>
-              </w:rPr>
-            </w:r>
           </w:p>
         </w:tc>
         <w:tc>
@@ -8350,12 +7351,6 @@
                 <w:szCs w:val="26"/>
               </w:rPr>
             </w:pPr>
-            <w:r>
-              <w:rPr>
-                <w:rFonts w:ascii="Times New Roman" w:hAnsi="Times New Roman"/>
-                <w:sz w:val="26"/>
-              </w:rPr>
-            </w:r>
           </w:p>
         </w:tc>
         <w:tc>
@@ -8377,12 +7372,6 @@
                 <w:szCs w:val="26"/>
               </w:rPr>
             </w:pPr>
-            <w:r>
-              <w:rPr>
-                <w:rFonts w:ascii="Times New Roman" w:hAnsi="Times New Roman"/>
-                <w:sz w:val="26"/>
-              </w:rPr>
-            </w:r>
           </w:p>
         </w:tc>
         <w:tc>
@@ -8404,12 +7393,6 @@
                 <w:szCs w:val="26"/>
               </w:rPr>
             </w:pPr>
-            <w:r>
-              <w:rPr>
-                <w:rFonts w:ascii="Times New Roman" w:hAnsi="Times New Roman"/>
-                <w:sz w:val="26"/>
-              </w:rPr>
-            </w:r>
           </w:p>
         </w:tc>
       </w:tr>
@@ -8489,13 +7472,6 @@
                 <w:szCs w:val="26"/>
               </w:rPr>
             </w:pPr>
-            <w:r>
-              <w:rPr>
-                <w:rFonts w:ascii="Times New Roman" w:hAnsi="Times New Roman" w:cs="Times New Roman"/>
-                <w:sz w:val="26"/>
-                <w:szCs w:val="26"/>
-              </w:rPr>
-            </w:r>
           </w:p>
         </w:tc>
         <w:tc>
@@ -8517,13 +7493,6 @@
                 <w:szCs w:val="26"/>
               </w:rPr>
             </w:pPr>
-            <w:r>
-              <w:rPr>
-                <w:rFonts w:ascii="Times New Roman" w:hAnsi="Times New Roman" w:cs="Times New Roman"/>
-                <w:sz w:val="26"/>
-                <w:szCs w:val="26"/>
-              </w:rPr>
-            </w:r>
           </w:p>
         </w:tc>
         <w:tc>
@@ -8545,13 +7514,6 @@
                 <w:szCs w:val="26"/>
               </w:rPr>
             </w:pPr>
-            <w:r>
-              <w:rPr>
-                <w:rFonts w:ascii="Times New Roman" w:hAnsi="Times New Roman" w:cs="Times New Roman"/>
-                <w:sz w:val="26"/>
-                <w:szCs w:val="26"/>
-              </w:rPr>
-            </w:r>
           </w:p>
         </w:tc>
         <w:tc>
@@ -8573,13 +7535,6 @@
                 <w:szCs w:val="26"/>
               </w:rPr>
             </w:pPr>
-            <w:r>
-              <w:rPr>
-                <w:rFonts w:ascii="Times New Roman" w:hAnsi="Times New Roman" w:cs="Times New Roman"/>
-                <w:sz w:val="26"/>
-                <w:szCs w:val="26"/>
-              </w:rPr>
-            </w:r>
           </w:p>
         </w:tc>
         <w:tc>
@@ -8601,13 +7556,6 @@
                 <w:szCs w:val="26"/>
               </w:rPr>
             </w:pPr>
-            <w:r>
-              <w:rPr>
-                <w:rFonts w:ascii="Times New Roman" w:hAnsi="Times New Roman" w:cs="Times New Roman"/>
-                <w:sz w:val="26"/>
-                <w:szCs w:val="26"/>
-              </w:rPr>
-            </w:r>
           </w:p>
         </w:tc>
       </w:tr>
@@ -8687,13 +7635,6 @@
                 <w:szCs w:val="26"/>
               </w:rPr>
             </w:pPr>
-            <w:r>
-              <w:rPr>
-                <w:rFonts w:ascii="Times New Roman" w:hAnsi="Times New Roman" w:cs="Times New Roman"/>
-                <w:sz w:val="26"/>
-                <w:szCs w:val="26"/>
-              </w:rPr>
-            </w:r>
           </w:p>
         </w:tc>
         <w:tc>
@@ -8715,13 +7656,6 @@
                 <w:szCs w:val="26"/>
               </w:rPr>
             </w:pPr>
-            <w:r>
-              <w:rPr>
-                <w:rFonts w:ascii="Times New Roman" w:hAnsi="Times New Roman" w:cs="Times New Roman"/>
-                <w:sz w:val="26"/>
-                <w:szCs w:val="26"/>
-              </w:rPr>
-            </w:r>
           </w:p>
         </w:tc>
         <w:tc>
@@ -8743,13 +7677,6 @@
                 <w:szCs w:val="26"/>
               </w:rPr>
             </w:pPr>
-            <w:r>
-              <w:rPr>
-                <w:rFonts w:ascii="Times New Roman" w:hAnsi="Times New Roman" w:cs="Times New Roman"/>
-                <w:sz w:val="26"/>
-                <w:szCs w:val="26"/>
-              </w:rPr>
-            </w:r>
           </w:p>
         </w:tc>
         <w:tc>
@@ -8771,13 +7698,6 @@
                 <w:szCs w:val="26"/>
               </w:rPr>
             </w:pPr>
-            <w:r>
-              <w:rPr>
-                <w:rFonts w:ascii="Times New Roman" w:hAnsi="Times New Roman" w:cs="Times New Roman"/>
-                <w:sz w:val="26"/>
-                <w:szCs w:val="26"/>
-              </w:rPr>
-            </w:r>
           </w:p>
         </w:tc>
         <w:tc>
@@ -8799,13 +7719,6 @@
                 <w:szCs w:val="26"/>
               </w:rPr>
             </w:pPr>
-            <w:r>
-              <w:rPr>
-                <w:rFonts w:ascii="Times New Roman" w:hAnsi="Times New Roman" w:cs="Times New Roman"/>
-                <w:sz w:val="26"/>
-                <w:szCs w:val="26"/>
-              </w:rPr>
-            </w:r>
           </w:p>
         </w:tc>
       </w:tr>
@@ -8885,12 +7798,6 @@
                 <w:szCs w:val="26"/>
               </w:rPr>
             </w:pPr>
-            <w:r>
-              <w:rPr>
-                <w:rFonts w:ascii="Times New Roman" w:hAnsi="Times New Roman"/>
-                <w:sz w:val="26"/>
-              </w:rPr>
-            </w:r>
           </w:p>
         </w:tc>
         <w:tc>
@@ -8912,12 +7819,6 @@
                 <w:szCs w:val="26"/>
               </w:rPr>
             </w:pPr>
-            <w:r>
-              <w:rPr>
-                <w:rFonts w:ascii="Times New Roman" w:hAnsi="Times New Roman"/>
-                <w:sz w:val="26"/>
-              </w:rPr>
-            </w:r>
           </w:p>
         </w:tc>
         <w:tc>
@@ -8939,12 +7840,6 @@
                 <w:szCs w:val="26"/>
               </w:rPr>
             </w:pPr>
-            <w:r>
-              <w:rPr>
-                <w:rFonts w:ascii="Times New Roman" w:hAnsi="Times New Roman"/>
-                <w:sz w:val="26"/>
-              </w:rPr>
-            </w:r>
           </w:p>
         </w:tc>
         <w:tc>
@@ -8966,12 +7861,6 @@
                 <w:szCs w:val="26"/>
               </w:rPr>
             </w:pPr>
-            <w:r>
-              <w:rPr>
-                <w:rFonts w:ascii="Times New Roman" w:hAnsi="Times New Roman"/>
-                <w:sz w:val="26"/>
-              </w:rPr>
-            </w:r>
           </w:p>
         </w:tc>
         <w:tc>
@@ -8993,12 +7882,6 @@
                 <w:szCs w:val="26"/>
               </w:rPr>
             </w:pPr>
-            <w:r>
-              <w:rPr>
-                <w:rFonts w:ascii="Times New Roman" w:hAnsi="Times New Roman"/>
-                <w:sz w:val="26"/>
-              </w:rPr>
-            </w:r>
           </w:p>
         </w:tc>
       </w:tr>
@@ -9082,13 +7965,6 @@
                 <w:szCs w:val="26"/>
               </w:rPr>
             </w:pPr>
-            <w:r>
-              <w:rPr>
-                <w:rFonts w:ascii="Times New Roman" w:hAnsi="Times New Roman" w:cs="Times New Roman"/>
-                <w:sz w:val="26"/>
-                <w:szCs w:val="26"/>
-              </w:rPr>
-            </w:r>
           </w:p>
         </w:tc>
         <w:tc>
@@ -9110,13 +7986,6 @@
                 <w:szCs w:val="26"/>
               </w:rPr>
             </w:pPr>
-            <w:r>
-              <w:rPr>
-                <w:rFonts w:ascii="Times New Roman" w:hAnsi="Times New Roman" w:cs="Times New Roman"/>
-                <w:sz w:val="26"/>
-                <w:szCs w:val="26"/>
-              </w:rPr>
-            </w:r>
           </w:p>
         </w:tc>
         <w:tc>
@@ -9138,13 +8007,6 @@
                 <w:szCs w:val="26"/>
               </w:rPr>
             </w:pPr>
-            <w:r>
-              <w:rPr>
-                <w:rFonts w:ascii="Times New Roman" w:hAnsi="Times New Roman" w:cs="Times New Roman"/>
-                <w:sz w:val="26"/>
-                <w:szCs w:val="26"/>
-              </w:rPr>
-            </w:r>
           </w:p>
         </w:tc>
         <w:tc>
@@ -9166,13 +8028,6 @@
                 <w:szCs w:val="26"/>
               </w:rPr>
             </w:pPr>
-            <w:r>
-              <w:rPr>
-                <w:rFonts w:ascii="Times New Roman" w:hAnsi="Times New Roman" w:cs="Times New Roman"/>
-                <w:sz w:val="26"/>
-                <w:szCs w:val="26"/>
-              </w:rPr>
-            </w:r>
           </w:p>
         </w:tc>
         <w:tc>
@@ -9194,13 +8049,6 @@
                 <w:szCs w:val="26"/>
               </w:rPr>
             </w:pPr>
-            <w:r>
-              <w:rPr>
-                <w:rFonts w:ascii="Times New Roman" w:hAnsi="Times New Roman" w:cs="Times New Roman"/>
-                <w:sz w:val="26"/>
-                <w:szCs w:val="26"/>
-              </w:rPr>
-            </w:r>
           </w:p>
         </w:tc>
       </w:tr>
@@ -9280,13 +8128,6 @@
                 <w:szCs w:val="26"/>
               </w:rPr>
             </w:pPr>
-            <w:r>
-              <w:rPr>
-                <w:rFonts w:ascii="Times New Roman" w:hAnsi="Times New Roman" w:cs="Times New Roman"/>
-                <w:sz w:val="26"/>
-                <w:szCs w:val="26"/>
-              </w:rPr>
-            </w:r>
           </w:p>
         </w:tc>
         <w:tc>
@@ -9308,13 +8149,6 @@
                 <w:szCs w:val="26"/>
               </w:rPr>
             </w:pPr>
-            <w:r>
-              <w:rPr>
-                <w:rFonts w:ascii="Times New Roman" w:hAnsi="Times New Roman" w:cs="Times New Roman"/>
-                <w:sz w:val="26"/>
-                <w:szCs w:val="26"/>
-              </w:rPr>
-            </w:r>
           </w:p>
         </w:tc>
         <w:tc>
@@ -9336,13 +8170,6 @@
                 <w:szCs w:val="26"/>
               </w:rPr>
             </w:pPr>
-            <w:r>
-              <w:rPr>
-                <w:rFonts w:ascii="Times New Roman" w:hAnsi="Times New Roman" w:cs="Times New Roman"/>
-                <w:sz w:val="26"/>
-                <w:szCs w:val="26"/>
-              </w:rPr>
-            </w:r>
           </w:p>
         </w:tc>
         <w:tc>
@@ -9364,13 +8191,6 @@
                 <w:szCs w:val="26"/>
               </w:rPr>
             </w:pPr>
-            <w:r>
-              <w:rPr>
-                <w:rFonts w:ascii="Times New Roman" w:hAnsi="Times New Roman" w:cs="Times New Roman"/>
-                <w:sz w:val="26"/>
-                <w:szCs w:val="26"/>
-              </w:rPr>
-            </w:r>
           </w:p>
         </w:tc>
         <w:tc>
@@ -9392,13 +8212,6 @@
                 <w:szCs w:val="26"/>
               </w:rPr>
             </w:pPr>
-            <w:r>
-              <w:rPr>
-                <w:rFonts w:ascii="Times New Roman" w:hAnsi="Times New Roman" w:cs="Times New Roman"/>
-                <w:sz w:val="26"/>
-                <w:szCs w:val="26"/>
-              </w:rPr>
-            </w:r>
           </w:p>
         </w:tc>
       </w:tr>
@@ -9478,13 +8291,6 @@
                 <w:szCs w:val="26"/>
               </w:rPr>
             </w:pPr>
-            <w:r>
-              <w:rPr>
-                <w:rFonts w:ascii="Times New Roman" w:hAnsi="Times New Roman" w:cs="Times New Roman"/>
-                <w:sz w:val="26"/>
-                <w:szCs w:val="26"/>
-              </w:rPr>
-            </w:r>
           </w:p>
         </w:tc>
         <w:tc>
@@ -9506,13 +8312,6 @@
                 <w:szCs w:val="26"/>
               </w:rPr>
             </w:pPr>
-            <w:r>
-              <w:rPr>
-                <w:rFonts w:ascii="Times New Roman" w:hAnsi="Times New Roman" w:cs="Times New Roman"/>
-                <w:sz w:val="26"/>
-                <w:szCs w:val="26"/>
-              </w:rPr>
-            </w:r>
           </w:p>
         </w:tc>
         <w:tc>
@@ -9534,13 +8333,6 @@
                 <w:szCs w:val="26"/>
               </w:rPr>
             </w:pPr>
-            <w:r>
-              <w:rPr>
-                <w:rFonts w:ascii="Times New Roman" w:hAnsi="Times New Roman" w:cs="Times New Roman"/>
-                <w:sz w:val="26"/>
-                <w:szCs w:val="26"/>
-              </w:rPr>
-            </w:r>
           </w:p>
         </w:tc>
         <w:tc>
@@ -9562,13 +8354,6 @@
                 <w:szCs w:val="26"/>
               </w:rPr>
             </w:pPr>
-            <w:r>
-              <w:rPr>
-                <w:rFonts w:ascii="Times New Roman" w:hAnsi="Times New Roman" w:cs="Times New Roman"/>
-                <w:sz w:val="26"/>
-                <w:szCs w:val="26"/>
-              </w:rPr>
-            </w:r>
           </w:p>
         </w:tc>
         <w:tc>
@@ -9590,13 +8375,6 @@
                 <w:szCs w:val="26"/>
               </w:rPr>
             </w:pPr>
-            <w:r>
-              <w:rPr>
-                <w:rFonts w:ascii="Times New Roman" w:hAnsi="Times New Roman" w:cs="Times New Roman"/>
-                <w:sz w:val="26"/>
-                <w:szCs w:val="26"/>
-              </w:rPr>
-            </w:r>
           </w:p>
         </w:tc>
       </w:tr>
@@ -9676,13 +8454,6 @@
                 <w:szCs w:val="26"/>
               </w:rPr>
             </w:pPr>
-            <w:r>
-              <w:rPr>
-                <w:rFonts w:ascii="Times New Roman" w:hAnsi="Times New Roman" w:cs="Times New Roman"/>
-                <w:sz w:val="26"/>
-                <w:szCs w:val="26"/>
-              </w:rPr>
-            </w:r>
           </w:p>
         </w:tc>
         <w:tc>
@@ -9704,13 +8475,6 @@
                 <w:szCs w:val="26"/>
               </w:rPr>
             </w:pPr>
-            <w:r>
-              <w:rPr>
-                <w:rFonts w:ascii="Times New Roman" w:hAnsi="Times New Roman" w:cs="Times New Roman"/>
-                <w:sz w:val="26"/>
-                <w:szCs w:val="26"/>
-              </w:rPr>
-            </w:r>
           </w:p>
         </w:tc>
         <w:tc>
@@ -9732,13 +8496,6 @@
                 <w:szCs w:val="26"/>
               </w:rPr>
             </w:pPr>
-            <w:r>
-              <w:rPr>
-                <w:rFonts w:ascii="Times New Roman" w:hAnsi="Times New Roman" w:cs="Times New Roman"/>
-                <w:sz w:val="26"/>
-                <w:szCs w:val="26"/>
-              </w:rPr>
-            </w:r>
           </w:p>
         </w:tc>
         <w:tc>
@@ -9760,13 +8517,6 @@
                 <w:szCs w:val="26"/>
               </w:rPr>
             </w:pPr>
-            <w:r>
-              <w:rPr>
-                <w:rFonts w:ascii="Times New Roman" w:hAnsi="Times New Roman" w:cs="Times New Roman"/>
-                <w:sz w:val="26"/>
-                <w:szCs w:val="26"/>
-              </w:rPr>
-            </w:r>
           </w:p>
         </w:tc>
         <w:tc>
@@ -9788,13 +8538,6 @@
                 <w:szCs w:val="26"/>
               </w:rPr>
             </w:pPr>
-            <w:r>
-              <w:rPr>
-                <w:rFonts w:ascii="Times New Roman" w:hAnsi="Times New Roman" w:cs="Times New Roman"/>
-                <w:sz w:val="26"/>
-                <w:szCs w:val="26"/>
-              </w:rPr>
-            </w:r>
           </w:p>
         </w:tc>
       </w:tr>
@@ -9874,12 +8617,6 @@
                 <w:szCs w:val="26"/>
               </w:rPr>
             </w:pPr>
-            <w:r>
-              <w:rPr>
-                <w:rFonts w:ascii="Times New Roman" w:hAnsi="Times New Roman"/>
-                <w:sz w:val="26"/>
-              </w:rPr>
-            </w:r>
           </w:p>
         </w:tc>
         <w:tc>
@@ -9901,12 +8638,6 @@
                 <w:szCs w:val="26"/>
               </w:rPr>
             </w:pPr>
-            <w:r>
-              <w:rPr>
-                <w:rFonts w:ascii="Times New Roman" w:hAnsi="Times New Roman"/>
-                <w:sz w:val="26"/>
-              </w:rPr>
-            </w:r>
           </w:p>
         </w:tc>
         <w:tc>
@@ -9928,12 +8659,6 @@
                 <w:szCs w:val="26"/>
               </w:rPr>
             </w:pPr>
-            <w:r>
-              <w:rPr>
-                <w:rFonts w:ascii="Times New Roman" w:hAnsi="Times New Roman"/>
-                <w:sz w:val="26"/>
-              </w:rPr>
-            </w:r>
           </w:p>
         </w:tc>
         <w:tc>
@@ -9955,12 +8680,6 @@
                 <w:szCs w:val="26"/>
               </w:rPr>
             </w:pPr>
-            <w:r>
-              <w:rPr>
-                <w:rFonts w:ascii="Times New Roman" w:hAnsi="Times New Roman"/>
-                <w:sz w:val="26"/>
-              </w:rPr>
-            </w:r>
           </w:p>
         </w:tc>
         <w:tc>
@@ -9982,12 +8701,6 @@
                 <w:szCs w:val="26"/>
               </w:rPr>
             </w:pPr>
-            <w:r>
-              <w:rPr>
-                <w:rFonts w:ascii="Times New Roman" w:hAnsi="Times New Roman"/>
-                <w:sz w:val="26"/>
-              </w:rPr>
-            </w:r>
           </w:p>
         </w:tc>
       </w:tr>
@@ -10471,13 +9184,6 @@
                 <w:szCs w:val="26"/>
               </w:rPr>
             </w:pPr>
-            <w:r>
-              <w:rPr>
-                <w:rFonts w:ascii="Times New Roman" w:hAnsi="Times New Roman" w:cs="Times New Roman"/>
-                <w:sz w:val="26"/>
-                <w:szCs w:val="26"/>
-              </w:rPr>
-            </w:r>
           </w:p>
         </w:tc>
         <w:tc>
@@ -10499,13 +9205,6 @@
                 <w:szCs w:val="26"/>
               </w:rPr>
             </w:pPr>
-            <w:r>
-              <w:rPr>
-                <w:rFonts w:ascii="Times New Roman" w:hAnsi="Times New Roman" w:cs="Times New Roman"/>
-                <w:sz w:val="26"/>
-                <w:szCs w:val="26"/>
-              </w:rPr>
-            </w:r>
           </w:p>
         </w:tc>
         <w:tc>
@@ -10527,13 +9226,6 @@
                 <w:szCs w:val="26"/>
               </w:rPr>
             </w:pPr>
-            <w:r>
-              <w:rPr>
-                <w:rFonts w:ascii="Times New Roman" w:hAnsi="Times New Roman" w:cs="Times New Roman"/>
-                <w:sz w:val="26"/>
-                <w:szCs w:val="26"/>
-              </w:rPr>
-            </w:r>
           </w:p>
         </w:tc>
         <w:tc>
@@ -10555,13 +9247,6 @@
                 <w:szCs w:val="26"/>
               </w:rPr>
             </w:pPr>
-            <w:r>
-              <w:rPr>
-                <w:rFonts w:ascii="Times New Roman" w:hAnsi="Times New Roman" w:cs="Times New Roman"/>
-                <w:sz w:val="26"/>
-                <w:szCs w:val="26"/>
-              </w:rPr>
-            </w:r>
           </w:p>
         </w:tc>
         <w:tc>
@@ -10583,13 +9268,6 @@
                 <w:szCs w:val="26"/>
               </w:rPr>
             </w:pPr>
-            <w:r>
-              <w:rPr>
-                <w:rFonts w:ascii="Times New Roman" w:hAnsi="Times New Roman" w:cs="Times New Roman"/>
-                <w:sz w:val="26"/>
-                <w:szCs w:val="26"/>
-              </w:rPr>
-            </w:r>
           </w:p>
         </w:tc>
       </w:tr>
@@ -10666,12 +9344,6 @@
                 <w:szCs w:val="26"/>
               </w:rPr>
             </w:pPr>
-            <w:r>
-              <w:rPr>
-                <w:rFonts w:ascii="Times New Roman" w:hAnsi="Times New Roman"/>
-                <w:sz w:val="26"/>
-              </w:rPr>
-            </w:r>
           </w:p>
         </w:tc>
         <w:tc>
@@ -10693,12 +9365,6 @@
                 <w:szCs w:val="26"/>
               </w:rPr>
             </w:pPr>
-            <w:r>
-              <w:rPr>
-                <w:rFonts w:ascii="Times New Roman" w:hAnsi="Times New Roman"/>
-                <w:sz w:val="26"/>
-              </w:rPr>
-            </w:r>
           </w:p>
         </w:tc>
         <w:tc>
@@ -10720,12 +9386,6 @@
                 <w:szCs w:val="26"/>
               </w:rPr>
             </w:pPr>
-            <w:r>
-              <w:rPr>
-                <w:rFonts w:ascii="Times New Roman" w:hAnsi="Times New Roman"/>
-                <w:sz w:val="26"/>
-              </w:rPr>
-            </w:r>
           </w:p>
         </w:tc>
         <w:tc>
@@ -10747,12 +9407,6 @@
                 <w:szCs w:val="26"/>
               </w:rPr>
             </w:pPr>
-            <w:r>
-              <w:rPr>
-                <w:rFonts w:ascii="Times New Roman" w:hAnsi="Times New Roman"/>
-                <w:sz w:val="26"/>
-              </w:rPr>
-            </w:r>
           </w:p>
         </w:tc>
         <w:tc>
@@ -10774,12 +9428,6 @@
                 <w:szCs w:val="26"/>
               </w:rPr>
             </w:pPr>
-            <w:r>
-              <w:rPr>
-                <w:rFonts w:ascii="Times New Roman" w:hAnsi="Times New Roman"/>
-                <w:sz w:val="26"/>
-              </w:rPr>
-            </w:r>
           </w:p>
         </w:tc>
       </w:tr>
@@ -10856,12 +9504,6 @@
                 <w:szCs w:val="26"/>
               </w:rPr>
             </w:pPr>
-            <w:r>
-              <w:rPr>
-                <w:rFonts w:ascii="Times New Roman" w:hAnsi="Times New Roman"/>
-                <w:sz w:val="26"/>
-              </w:rPr>
-            </w:r>
           </w:p>
         </w:tc>
         <w:tc>
@@ -10883,12 +9525,6 @@
                 <w:szCs w:val="26"/>
               </w:rPr>
             </w:pPr>
-            <w:r>
-              <w:rPr>
-                <w:rFonts w:ascii="Times New Roman" w:hAnsi="Times New Roman"/>
-                <w:sz w:val="26"/>
-              </w:rPr>
-            </w:r>
           </w:p>
         </w:tc>
         <w:tc>
@@ -10910,12 +9546,6 @@
                 <w:szCs w:val="26"/>
               </w:rPr>
             </w:pPr>
-            <w:r>
-              <w:rPr>
-                <w:rFonts w:ascii="Times New Roman" w:hAnsi="Times New Roman"/>
-                <w:sz w:val="26"/>
-              </w:rPr>
-            </w:r>
           </w:p>
         </w:tc>
         <w:tc>
@@ -10937,12 +9567,6 @@
                 <w:szCs w:val="26"/>
               </w:rPr>
             </w:pPr>
-            <w:r>
-              <w:rPr>
-                <w:rFonts w:ascii="Times New Roman" w:hAnsi="Times New Roman"/>
-                <w:sz w:val="26"/>
-              </w:rPr>
-            </w:r>
           </w:p>
         </w:tc>
         <w:tc>
@@ -10964,12 +9588,6 @@
                 <w:szCs w:val="26"/>
               </w:rPr>
             </w:pPr>
-            <w:r>
-              <w:rPr>
-                <w:rFonts w:ascii="Times New Roman" w:hAnsi="Times New Roman"/>
-                <w:sz w:val="26"/>
-              </w:rPr>
-            </w:r>
           </w:p>
         </w:tc>
       </w:tr>
@@ -11064,27 +9682,6 @@
               <w:br/>
               <w:t>…………………………………………………………………</w:t>
             </w:r>
-            <w:r>
-              <w:rPr>
-                <w:rFonts w:ascii="Times New Roman" w:hAnsi="Times New Roman" w:cs="Times New Roman"/>
-                <w:sz w:val="26"/>
-                <w:szCs w:val="26"/>
-              </w:rPr>
-            </w:r>
-            <w:r>
-              <w:rPr>
-                <w:rFonts w:ascii="Times New Roman" w:hAnsi="Times New Roman" w:cs="Times New Roman"/>
-                <w:sz w:val="26"/>
-                <w:szCs w:val="26"/>
-              </w:rPr>
-            </w:r>
-            <w:r>
-              <w:rPr>
-                <w:rFonts w:ascii="Times New Roman" w:hAnsi="Times New Roman" w:cs="Times New Roman"/>
-                <w:sz w:val="26"/>
-                <w:szCs w:val="26"/>
-              </w:rPr>
-            </w:r>
           </w:p>
         </w:tc>
         <w:tc>
@@ -11116,6 +9713,43 @@
               </w:rPr>
               <w:br/>
               <w:t>Tổ trưởng</w:t>
+            </w:r>
+          </w:p>
+          <w:p>
+            <w:pPr>
+              <w:jc w:val="center"/>
+              <w:rPr>
+                <w:rFonts w:ascii="Times New Roman" w:hAnsi="Times New Roman" w:cs="Times New Roman"/>
+                <w:sz w:val="26"/>
+                <w:szCs w:val="26"/>
+              </w:rPr>
+            </w:pPr>
+          </w:p>
+          <w:p>
+            <w:pPr>
+              <w:jc w:val="center"/>
+              <w:rPr>
+                <w:rFonts w:ascii="Times New Roman" w:hAnsi="Times New Roman" w:cs="Times New Roman"/>
+                <w:sz w:val="26"/>
+                <w:szCs w:val="26"/>
+              </w:rPr>
+            </w:pPr>
+          </w:p>
+          <w:p>
+            <w:pPr>
+              <w:jc w:val="center"/>
+              <w:rPr>
+                <w:rFonts w:ascii="Times New Roman" w:hAnsi="Times New Roman" w:cs="Times New Roman"/>
+                <w:sz w:val="26"/>
+                <w:szCs w:val="26"/>
+              </w:rPr>
+            </w:pPr>
+            <w:r>
+              <w:rPr>
+                <w:rFonts w:ascii="Times New Roman" w:hAnsi="Times New Roman" w:cs="Times New Roman"/>
+                <w:sz w:val="26"/>
+                <w:szCs w:val="26"/>
+              </w:rPr>
               <w:br/>
               <w:t>Nguyễn Thị Ngọc Ánh</w:t>
             </w:r>
@@ -11126,7 +9760,6 @@
                 <w:szCs w:val="26"/>
               </w:rPr>
               <w:br/>
-              <w:t>(Ký tên, đóng dấu)</w:t>
             </w:r>
           </w:p>
         </w:tc>
@@ -11155,6 +9788,7 @@
           <w:color w:val="000000"/>
           <w:szCs w:val="28"/>
         </w:rPr>
+        <w:lastRenderedPageBreak/>
         <w:t>Nhận xét của BGH hoặc tổ trưởng chuyên môn về tiến độ thực hiện chương trình</w:t>
       </w:r>
     </w:p>

</xml_diff>